<commit_message>
chore: time com contas reais (sca-dev1, sca-dev2) como code owners
- CODEOWNERS: @ScaTecnologia, @sca-dev1 e @sca-dev2 em todas as áreas
  (basta 1 aprovação e nunca do próprio autor → sempre outra pessoa)
- SIMULANDO_2_DEVS: conta, chave SSH e gh por dev; revisão cruzada
- COLABORACAO_EQUIPE e STATUS: sem bypass do admin a partir de agora

Co-Authored-By: Claude Opus 5.5 <noreply@anthropic.com>
</commit_message>
<xml_diff>
--- a/docs/COLABORACAO_EQUIPE.docx
+++ b/docs/COLABORACAO_EQUIPE.docx
@@ -1206,22 +1206,67 @@
           <w:b/>
           <w:bCs/>
         </w:rPr>
-        <w:t xml:space="preserve">Bypass do admin só via PR</w:t>
-      </w:r>
-      <w:r>
-        <w:t xml:space="preserve">: enquanto existe uma única conta (ScaTecnologia), o admin pode fazer o merge sem a aprovação (</w:t>
-      </w:r>
-      <w:r>
-        <w:rPr>
-          <w:rStyle w:val="VerbatimChar"/>
-        </w:rPr>
-        <w:t xml:space="preserve">gh pr merge --admin</w:t>
-      </w:r>
-      <w:r>
-        <w:t xml:space="preserve"> </w:t>
-      </w:r>
-      <w:r>
-        <w:t xml:space="preserve">ou a caixa "bypass" no GitHub).</w:t>
+        <w:t xml:space="preserve">Sem bypass</w:t>
+      </w:r>
+      <w:r>
+        <w:t xml:space="preserve">: desde 2026-09-28 o time tem 3 contas —</w:t>
+      </w:r>
+      <w:r>
+        <w:t xml:space="preserve"> </w:t>
+      </w:r>
+      <w:r>
+        <w:rPr>
+          <w:rStyle w:val="VerbatimChar"/>
+        </w:rPr>
+        <w:t xml:space="preserve">@ScaTecnologia</w:t>
+      </w:r>
+      <w:r>
+        <w:t xml:space="preserve"> </w:t>
+      </w:r>
+      <w:r>
+        <w:t xml:space="preserve">(tech lead/admin),</w:t>
+      </w:r>
+      <w:r>
+        <w:t xml:space="preserve"> </w:t>
+      </w:r>
+      <w:r>
+        <w:rPr>
+          <w:rStyle w:val="VerbatimChar"/>
+        </w:rPr>
+        <w:t xml:space="preserve">@sca-dev1</w:t>
+      </w:r>
+      <w:r>
+        <w:t xml:space="preserve"> </w:t>
+      </w:r>
+      <w:r>
+        <w:t xml:space="preserve">e</w:t>
+      </w:r>
+      <w:r>
+        <w:t xml:space="preserve"> </w:t>
+      </w:r>
+      <w:r>
+        <w:rPr>
+          <w:rStyle w:val="VerbatimChar"/>
+        </w:rPr>
+        <w:t xml:space="preserve">@sca-dev2</w:t>
+      </w:r>
+      <w:r>
+        <w:t xml:space="preserve">, todos code owners. Nenhuma mudança entra na</w:t>
+      </w:r>
+      <w:r>
+        <w:t xml:space="preserve"> </w:t>
+      </w:r>
+      <w:r>
+        <w:rPr>
+          <w:rStyle w:val="VerbatimChar"/>
+        </w:rPr>
+        <w:t xml:space="preserve">main</w:t>
+      </w:r>
+      <w:r>
+        <w:t xml:space="preserve"> </w:t>
+      </w:r>
+      <w:r>
+        <w:t xml:space="preserve">sem a aprovação de</w:t>
       </w:r>
       <w:r>
         <w:t xml:space="preserve"> </w:t>
@@ -1231,13 +1276,13 @@
           <w:b/>
           <w:bCs/>
         </w:rPr>
-        <w:t xml:space="preserve">Quando o 2º dev entrar, remova o bypass</w:t>
-      </w:r>
-      <w:r>
-        <w:t xml:space="preserve"> </w:t>
-      </w:r>
-      <w:r>
-        <w:t xml:space="preserve">para a revisão virar obrigatória de verdade.</w:t>
+        <w:t xml:space="preserve">outra</w:t>
+      </w:r>
+      <w:r>
+        <w:t xml:space="preserve"> </w:t>
+      </w:r>
+      <w:r>
+        <w:t xml:space="preserve">pessoa do time — nem as do admin. (Antes disso, com uma conta só, o admin podia dispensar a aprovação.)</w:t>
       </w:r>
     </w:p>
     <w:p>

</xml_diff>